<commit_message>
Updated slides for sessions 8 and 9
Updated time slot for second session on each afternoon
</commit_message>
<xml_diff>
--- a/09_session09/questions_session09.docx
+++ b/09_session09/questions_session09.docx
@@ -186,6 +186,12 @@
           <w:bCs/>
         </w:rPr>
         <w:t>For the last session, you listed two potential confounders of the relationship between your independent (treatment) variable and your dependent (outcome) variable. Now draw a DAG that represents your causal relationship of interest and shows how these two potential confounders are connected to both the treatment and the outcome.</w:t>
+      </w:r>
+      <w:r>
+        <w:rPr>
+          <w:lang w:val="en-US"/>
+        </w:rPr>
+        <w:t xml:space="preserve"> Hint: see slide 12 of the session 3 slides (“Models: concepts and relationships”), DAG 3 “Confounding”.</w:t>
       </w:r>
     </w:p>
     <w:p>
@@ -451,7 +457,7 @@
         <w:szCs w:val="18"/>
         <w:lang w:val="en-US"/>
       </w:rPr>
-      <w:t>5</w:t>
+      <w:t>6</w:t>
     </w:r>
   </w:p>
 </w:hdr>

</xml_diff>